<commit_message>
Update report.docx for lab10 (quarto build)
</commit_message>
<xml_diff>
--- a/labs/lab10/report.docx
+++ b/labs/lab10/report.docx
@@ -18,13 +18,64 @@
         <w:t xml:space="preserve">Редактор vi</w:t>
       </w:r>
     </w:p>
-    <w:bookmarkStart w:id="9" w:name="цель-работы"/>
+    <w:p>
+      <w:pPr>
+        <w:pStyle w:val="Author"/>
+      </w:pPr>
+      <w:r>
+        <w:t xml:space="preserve">Савкин Дмитрий Вадимович</w:t>
+      </w:r>
+    </w:p>
+    <w:p>
+      <w:pPr>
+        <w:pStyle w:val="Date"/>
+      </w:pPr>
+      <w:r>
+        <w:t xml:space="preserve">2026-10-12</w:t>
+      </w:r>
+    </w:p>
+    <w:sdt>
+      <w:sdtPr>
+        <w:docPartObj>
+          <w:docPartGallery w:val="Table of Contents"/>
+          <w:docPartUnique/>
+        </w:docPartObj>
+      </w:sdtPr>
+      <w:sdtContent>
+        <w:p>
+          <w:pPr>
+            <w:pStyle w:val="TOCHeading"/>
+          </w:pPr>
+          <w:r>
+            <w:t xml:space="preserve">Содержание</w:t>
+          </w:r>
+        </w:p>
+        <w:p>
+          <w:r>
+            <w:fldChar w:fldCharType="begin" w:dirty="true"/>
+            <w:instrText xml:space="preserve">TOC \o "1-2" \h \z \u</w:instrText>
+            <w:fldChar w:fldCharType="separate"/>
+            <w:fldChar w:fldCharType="end"/>
+          </w:r>
+        </w:p>
+      </w:sdtContent>
+    </w:sdt>
+    <w:bookmarkStart w:id="15" w:name="введение"/>
     <w:p>
       <w:pPr>
         <w:pStyle w:val="Heading1"/>
       </w:pPr>
       <w:r>
-        <w:t xml:space="preserve">Цель работы</w:t>
+        <w:t xml:space="preserve">1. Введение</w:t>
+      </w:r>
+    </w:p>
+    <w:bookmarkStart w:id="9" w:name="актуальность"/>
+    <w:p>
+      <w:pPr>
+        <w:pStyle w:val="Heading2"/>
+      </w:pPr>
+      <w:r>
+        <w:t xml:space="preserve">1.1 Актуальность</w:t>
       </w:r>
     </w:p>
     <w:p>
@@ -32,17 +83,35 @@
         <w:pStyle w:val="FirstParagraph"/>
       </w:pPr>
       <w:r>
+        <w:t xml:space="preserve">vi/vim — редактор, присутствующий практически в любом Unix-окружении по умолчанию, что делает его знание необходимым минимумом.</w:t>
+      </w:r>
+    </w:p>
+    <w:bookmarkEnd w:id="9"/>
+    <w:bookmarkStart w:id="10" w:name="цель-работы"/>
+    <w:p>
+      <w:pPr>
+        <w:pStyle w:val="Heading2"/>
+      </w:pPr>
+      <w:r>
+        <w:t xml:space="preserve">1.2 Цель работы</w:t>
+      </w:r>
+    </w:p>
+    <w:p>
+      <w:pPr>
+        <w:pStyle w:val="FirstParagraph"/>
+      </w:pPr>
+      <w:r>
         <w:t xml:space="preserve">Получение практических навыков работы с текстовым редактором vi.</w:t>
       </w:r>
     </w:p>
-    <w:bookmarkEnd w:id="9"/>
-    <w:bookmarkStart w:id="10" w:name="задание"/>
-    <w:p>
-      <w:pPr>
-        <w:pStyle w:val="Heading1"/>
-      </w:pPr>
-      <w:r>
-        <w:t xml:space="preserve">Задание</w:t>
+    <w:bookmarkEnd w:id="10"/>
+    <w:bookmarkStart w:id="11" w:name="задачи"/>
+    <w:p>
+      <w:pPr>
+        <w:pStyle w:val="Heading2"/>
+      </w:pPr>
+      <w:r>
+        <w:t xml:space="preserve">1.3 Задачи</w:t>
       </w:r>
     </w:p>
     <w:p>
@@ -81,14 +150,69 @@
         <w:t xml:space="preserve">Отредактировать: заменить текст, вставить и удалить строку, отменить действие, сохранить.</w:t>
       </w:r>
     </w:p>
-    <w:bookmarkEnd w:id="10"/>
-    <w:bookmarkStart w:id="44" w:name="выполнение-лабораторной-работы"/>
+    <w:bookmarkEnd w:id="11"/>
+    <w:bookmarkStart w:id="12" w:name="объект-и-предмет-исследования"/>
+    <w:p>
+      <w:pPr>
+        <w:pStyle w:val="Heading2"/>
+      </w:pPr>
+      <w:r>
+        <w:t xml:space="preserve">1.4 Объект и предмет исследования</w:t>
+      </w:r>
+    </w:p>
+    <w:p>
+      <w:pPr>
+        <w:pStyle w:val="FirstParagraph"/>
+      </w:pPr>
+      <w:r>
+        <w:t xml:space="preserve">Объект — текстовый редактор vi; предмет — режимы работы и команды редактирования.</w:t>
+      </w:r>
+    </w:p>
+    <w:bookmarkEnd w:id="12"/>
+    <w:bookmarkStart w:id="13" w:name="методы-исследования"/>
+    <w:p>
+      <w:pPr>
+        <w:pStyle w:val="Heading2"/>
+      </w:pPr>
+      <w:r>
+        <w:t xml:space="preserve">1.5 Методы исследования</w:t>
+      </w:r>
+    </w:p>
+    <w:p>
+      <w:pPr>
+        <w:pStyle w:val="FirstParagraph"/>
+      </w:pPr>
+      <w:r>
+        <w:t xml:space="preserve">Эмпирический метод: практическое выполнение заданий в виртуальной машине Fedora Linux с фиксацией результатов скриншотами и видеозаписью.</w:t>
+      </w:r>
+    </w:p>
+    <w:bookmarkEnd w:id="13"/>
+    <w:bookmarkStart w:id="14" w:name="схема-выполнения-работы"/>
+    <w:p>
+      <w:pPr>
+        <w:pStyle w:val="Heading2"/>
+      </w:pPr>
+      <w:r>
+        <w:t xml:space="preserve">1.6 Схема выполнения работы</w:t>
+      </w:r>
+    </w:p>
+    <w:p>
+      <w:pPr>
+        <w:pStyle w:val="FirstParagraph"/>
+      </w:pPr>
+      <w:r>
+        <w:t xml:space="preserve">Работа выполнялась по стандартной схеме курса: выполнение действия в виртуальной машине, фиксация скриншотом, занесение в отчёт, публикация в git-репозиторий отдельным релизом.</w:t>
+      </w:r>
+    </w:p>
+    <w:bookmarkEnd w:id="14"/>
+    <w:bookmarkEnd w:id="15"/>
+    <w:bookmarkStart w:id="16" w:name="теоретическая-часть"/>
     <w:p>
       <w:pPr>
         <w:pStyle w:val="Heading1"/>
       </w:pPr>
       <w:r>
-        <w:t xml:space="preserve">Выполнение лабораторной работы</w:t>
+        <w:t xml:space="preserve">2. Теоретическая часть</w:t>
       </w:r>
     </w:p>
     <w:p>
@@ -96,6 +220,83 @@
         <w:pStyle w:val="FirstParagraph"/>
       </w:pPr>
       <w:r>
+        <w:t xml:space="preserve">vi — модальный текстовый редактор, стандартно доступный почти во всех дистрибутивах Unix/Linux. В отличие от немодальных редакторов, в vi явно разделены режимы: командный (навигация и редактирование одиночными клавишами), вставки (ввод текста) и последней строки (команды вида</w:t>
+      </w:r>
+      <w:r>
+        <w:t xml:space="preserve"> </w:t>
+      </w:r>
+      <w:r>
+        <w:rPr>
+          <w:rStyle w:val="VerbatimChar"/>
+        </w:rPr>
+        <w:t xml:space="preserve">:w</w:t>
+      </w:r>
+      <w:r>
+        <w:t xml:space="preserve">,</w:t>
+      </w:r>
+      <w:r>
+        <w:t xml:space="preserve"> </w:t>
+      </w:r>
+      <w:r>
+        <w:rPr>
+          <w:rStyle w:val="VerbatimChar"/>
+        </w:rPr>
+        <w:t xml:space="preserve">:q</w:t>
+      </w:r>
+      <w:r>
+        <w:t xml:space="preserve">).</w:t>
+      </w:r>
+    </w:p>
+    <w:p>
+      <w:pPr>
+        <w:pStyle w:val="BodyText"/>
+      </w:pPr>
+      <w:r>
+        <w:t xml:space="preserve">Более подробно см. в</w:t>
+      </w:r>
+      <w:r>
+        <w:t xml:space="preserve"> </w:t>
+      </w:r>
+      <w:r>
+        <w:t xml:space="preserve">[1]</w:t>
+      </w:r>
+      <w:r>
+        <w:t xml:space="preserve">.</w:t>
+      </w:r>
+    </w:p>
+    <w:bookmarkEnd w:id="16"/>
+    <w:bookmarkStart w:id="17" w:name="материалы-и-методы"/>
+    <w:p>
+      <w:pPr>
+        <w:pStyle w:val="Heading1"/>
+      </w:pPr>
+      <w:r>
+        <w:t xml:space="preserve">3. Материалы и методы</w:t>
+      </w:r>
+    </w:p>
+    <w:p>
+      <w:pPr>
+        <w:pStyle w:val="FirstParagraph"/>
+      </w:pPr>
+      <w:r>
+        <w:t xml:space="preserve">Используемое ПО и оборудование: хост-машина под управлением Windows, гипервизор VirtualBox, виртуальная машина с Fedora Linux (Sway), стандартные утилиты дистрибутива.</w:t>
+      </w:r>
+    </w:p>
+    <w:bookmarkEnd w:id="17"/>
+    <w:bookmarkStart w:id="51" w:name="выполнение-лабораторной-работы"/>
+    <w:p>
+      <w:pPr>
+        <w:pStyle w:val="Heading1"/>
+      </w:pPr>
+      <w:r>
+        <w:t xml:space="preserve">4. Выполнение лабораторной работы</w:t>
+      </w:r>
+    </w:p>
+    <w:p>
+      <w:pPr>
+        <w:pStyle w:val="FirstParagraph"/>
+      </w:pPr>
+      <w:r>
         <w:t xml:space="preserve">Создаём каталог и переходим в него:</w:t>
       </w:r>
       <w:r>
@@ -119,25 +320,25 @@
     </w:p>
     <w:p>
       <w:pPr>
-        <w:pStyle w:val="BodyText"/>
+        <w:pStyle w:val="CaptionedFigure"/>
       </w:pPr>
       <w:r>
         <w:drawing>
           <wp:inline>
             <wp:extent cx="3733800" cy="2100262"/>
             <wp:effectExtent b="0" l="0" r="0" t="0"/>
-            <wp:docPr descr="" title="" id="12" name="Picture"/>
+            <wp:docPr descr="Создаём каталог и переходим в него: ‘mkdir -p ~/work/os/lab06’, ‘cd ~/work/os/lab06’" title="" id="19" name="Picture"/>
             <a:graphic>
               <a:graphicData uri="http://schemas.openxmlformats.org/drawingml/2006/picture">
                 <pic:pic>
                   <pic:nvPicPr>
-                    <pic:cNvPr descr="фото/1.png" id="13" name="Picture"/>
+                    <pic:cNvPr descr="image/1.png" id="20" name="Picture"/>
                     <pic:cNvPicPr>
                       <a:picLocks noChangeArrowheads="1" noChangeAspect="1"/>
                     </pic:cNvPicPr>
                   </pic:nvPicPr>
                   <pic:blipFill>
-                    <a:blip r:embed="rId11"/>
+                    <a:blip r:embed="rId18"/>
                     <a:stretch>
                       <a:fillRect/>
                     </a:stretch>
@@ -166,6 +367,29 @@
     </w:p>
     <w:p>
       <w:pPr>
+        <w:pStyle w:val="ImageCaption"/>
+      </w:pPr>
+      <w:r>
+        <w:t xml:space="preserve">Создаём каталог и переходим в него:</w:t>
+      </w:r>
+      <w:r>
+        <w:t xml:space="preserve"> </w:t>
+      </w:r>
+      <w:r>
+        <w:t xml:space="preserve">‘mkdir -p ~/work/os/lab06’</w:t>
+      </w:r>
+      <w:r>
+        <w:t xml:space="preserve">,</w:t>
+      </w:r>
+      <w:r>
+        <w:t xml:space="preserve"> </w:t>
+      </w:r>
+      <w:r>
+        <w:t xml:space="preserve">‘cd ~/work/os/lab06’</w:t>
+      </w:r>
+    </w:p>
+    <w:p>
+      <w:pPr>
         <w:pStyle w:val="BodyText"/>
       </w:pPr>
       <w:r>
@@ -183,25 +407,25 @@
     </w:p>
     <w:p>
       <w:pPr>
-        <w:pStyle w:val="BodyText"/>
+        <w:pStyle w:val="CaptionedFigure"/>
       </w:pPr>
       <w:r>
         <w:drawing>
           <wp:inline>
             <wp:extent cx="3733800" cy="2100262"/>
             <wp:effectExtent b="0" l="0" r="0" t="0"/>
-            <wp:docPr descr="" title="" id="15" name="Picture"/>
+            <wp:docPr descr="Открываем новый файл: ‘vi hello.sh’" title="" id="22" name="Picture"/>
             <a:graphic>
               <a:graphicData uri="http://schemas.openxmlformats.org/drawingml/2006/picture">
                 <pic:pic>
                   <pic:nvPicPr>
-                    <pic:cNvPr descr="фото/2.png" id="16" name="Picture"/>
+                    <pic:cNvPr descr="image/2.png" id="23" name="Picture"/>
                     <pic:cNvPicPr>
                       <a:picLocks noChangeArrowheads="1" noChangeAspect="1"/>
                     </pic:cNvPicPr>
                   </pic:nvPicPr>
                   <pic:blipFill>
-                    <a:blip r:embed="rId14"/>
+                    <a:blip r:embed="rId21"/>
                     <a:stretch>
                       <a:fillRect/>
                     </a:stretch>
@@ -230,6 +454,20 @@
     </w:p>
     <w:p>
       <w:pPr>
+        <w:pStyle w:val="ImageCaption"/>
+      </w:pPr>
+      <w:r>
+        <w:t xml:space="preserve">Открываем новый файл:</w:t>
+      </w:r>
+      <w:r>
+        <w:t xml:space="preserve"> </w:t>
+      </w:r>
+      <w:r>
+        <w:t xml:space="preserve">‘vi hello.sh’</w:t>
+      </w:r>
+    </w:p>
+    <w:p>
+      <w:pPr>
         <w:pStyle w:val="BodyText"/>
       </w:pPr>
       <w:r>
@@ -253,25 +491,25 @@
     </w:p>
     <w:p>
       <w:pPr>
-        <w:pStyle w:val="BodyText"/>
+        <w:pStyle w:val="CaptionedFigure"/>
       </w:pPr>
       <w:r>
         <w:drawing>
           <wp:inline>
             <wp:extent cx="3733800" cy="2100262"/>
             <wp:effectExtent b="0" l="0" r="0" t="0"/>
-            <wp:docPr descr="" title="" id="18" name="Picture"/>
+            <wp:docPr descr="переходим в режим вставки (‘i’) и вводим текст скрипта, выходим клавишей ‘esc’" title="" id="25" name="Picture"/>
             <a:graphic>
               <a:graphicData uri="http://schemas.openxmlformats.org/drawingml/2006/picture">
                 <pic:pic>
                   <pic:nvPicPr>
-                    <pic:cNvPr descr="фото/3.png" id="19" name="Picture"/>
+                    <pic:cNvPr descr="image/3.png" id="26" name="Picture"/>
                     <pic:cNvPicPr>
                       <a:picLocks noChangeArrowheads="1" noChangeAspect="1"/>
                     </pic:cNvPicPr>
                   </pic:nvPicPr>
                   <pic:blipFill>
-                    <a:blip r:embed="rId17"/>
+                    <a:blip r:embed="rId24"/>
                     <a:stretch>
                       <a:fillRect/>
                     </a:stretch>
@@ -300,6 +538,26 @@
     </w:p>
     <w:p>
       <w:pPr>
+        <w:pStyle w:val="ImageCaption"/>
+      </w:pPr>
+      <w:r>
+        <w:t xml:space="preserve">переходим в режим вставки (</w:t>
+      </w:r>
+      <w:r>
+        <w:t xml:space="preserve">‘i’</w:t>
+      </w:r>
+      <w:r>
+        <w:t xml:space="preserve">) и вводим текст скрипта, выходим клавишей</w:t>
+      </w:r>
+      <w:r>
+        <w:t xml:space="preserve"> </w:t>
+      </w:r>
+      <w:r>
+        <w:t xml:space="preserve">‘esc’</w:t>
+      </w:r>
+    </w:p>
+    <w:p>
+      <w:pPr>
         <w:pStyle w:val="BodyText"/>
       </w:pPr>
       <w:r>
@@ -317,25 +575,25 @@
     </w:p>
     <w:p>
       <w:pPr>
-        <w:pStyle w:val="BodyText"/>
+        <w:pStyle w:val="CaptionedFigure"/>
       </w:pPr>
       <w:r>
         <w:drawing>
           <wp:inline>
             <wp:extent cx="3733800" cy="2100262"/>
             <wp:effectExtent b="0" l="0" r="0" t="0"/>
-            <wp:docPr descr="" title="" id="21" name="Picture"/>
+            <wp:docPr descr="Сохраняем и выходим: ‘:wq’" title="" id="28" name="Picture"/>
             <a:graphic>
               <a:graphicData uri="http://schemas.openxmlformats.org/drawingml/2006/picture">
                 <pic:pic>
                   <pic:nvPicPr>
-                    <pic:cNvPr descr="фото/4.png" id="22" name="Picture"/>
+                    <pic:cNvPr descr="image/4.png" id="29" name="Picture"/>
                     <pic:cNvPicPr>
                       <a:picLocks noChangeArrowheads="1" noChangeAspect="1"/>
                     </pic:cNvPicPr>
                   </pic:nvPicPr>
                   <pic:blipFill>
-                    <a:blip r:embed="rId20"/>
+                    <a:blip r:embed="rId27"/>
                     <a:stretch>
                       <a:fillRect/>
                     </a:stretch>
@@ -364,6 +622,20 @@
     </w:p>
     <w:p>
       <w:pPr>
+        <w:pStyle w:val="ImageCaption"/>
+      </w:pPr>
+      <w:r>
+        <w:t xml:space="preserve">Сохраняем и выходим:</w:t>
+      </w:r>
+      <w:r>
+        <w:t xml:space="preserve"> </w:t>
+      </w:r>
+      <w:r>
+        <w:t xml:space="preserve">‘:wq’</w:t>
+      </w:r>
+    </w:p>
+    <w:p>
+      <w:pPr>
         <w:pStyle w:val="BodyText"/>
       </w:pPr>
       <w:r>
@@ -390,25 +662,25 @@
     </w:p>
     <w:p>
       <w:pPr>
-        <w:pStyle w:val="BodyText"/>
+        <w:pStyle w:val="CaptionedFigure"/>
       </w:pPr>
       <w:r>
         <w:drawing>
           <wp:inline>
             <wp:extent cx="3733800" cy="2100262"/>
             <wp:effectExtent b="0" l="0" r="0" t="0"/>
-            <wp:docPr descr="" title="" id="24" name="Picture"/>
+            <wp:docPr descr="Делаем файл исполняемым и проверяем: ‘chmod +x hello.sh’, ‘cat hello.sh’" title="" id="31" name="Picture"/>
             <a:graphic>
               <a:graphicData uri="http://schemas.openxmlformats.org/drawingml/2006/picture">
                 <pic:pic>
                   <pic:nvPicPr>
-                    <pic:cNvPr descr="фото/5.png" id="25" name="Picture"/>
+                    <pic:cNvPr descr="image/5.png" id="32" name="Picture"/>
                     <pic:cNvPicPr>
                       <a:picLocks noChangeArrowheads="1" noChangeAspect="1"/>
                     </pic:cNvPicPr>
                   </pic:nvPicPr>
                   <pic:blipFill>
-                    <a:blip r:embed="rId23"/>
+                    <a:blip r:embed="rId30"/>
                     <a:stretch>
                       <a:fillRect/>
                     </a:stretch>
@@ -437,6 +709,29 @@
     </w:p>
     <w:p>
       <w:pPr>
+        <w:pStyle w:val="ImageCaption"/>
+      </w:pPr>
+      <w:r>
+        <w:t xml:space="preserve">Делаем файл исполняемым и проверяем:</w:t>
+      </w:r>
+      <w:r>
+        <w:t xml:space="preserve"> </w:t>
+      </w:r>
+      <w:r>
+        <w:t xml:space="preserve">‘chmod +x hello.sh’</w:t>
+      </w:r>
+      <w:r>
+        <w:t xml:space="preserve">,</w:t>
+      </w:r>
+      <w:r>
+        <w:t xml:space="preserve"> </w:t>
+      </w:r>
+      <w:r>
+        <w:t xml:space="preserve">‘cat hello.sh’</w:t>
+      </w:r>
+    </w:p>
+    <w:p>
+      <w:pPr>
         <w:pStyle w:val="BodyText"/>
       </w:pPr>
       <w:r>
@@ -454,25 +749,25 @@
     </w:p>
     <w:p>
       <w:pPr>
-        <w:pStyle w:val="BodyText"/>
+        <w:pStyle w:val="CaptionedFigure"/>
       </w:pPr>
       <w:r>
         <w:drawing>
           <wp:inline>
             <wp:extent cx="3733800" cy="2100262"/>
             <wp:effectExtent b="0" l="0" r="0" t="0"/>
-            <wp:docPr descr="" title="" id="27" name="Picture"/>
+            <wp:docPr descr="Снова открываем файл: ‘vi hello.sh’" title="" id="34" name="Picture"/>
             <a:graphic>
               <a:graphicData uri="http://schemas.openxmlformats.org/drawingml/2006/picture">
                 <pic:pic>
                   <pic:nvPicPr>
-                    <pic:cNvPr descr="фото/6.png" id="28" name="Picture"/>
+                    <pic:cNvPr descr="image/6.png" id="35" name="Picture"/>
                     <pic:cNvPicPr>
                       <a:picLocks noChangeArrowheads="1" noChangeAspect="1"/>
                     </pic:cNvPicPr>
                   </pic:nvPicPr>
                   <pic:blipFill>
-                    <a:blip r:embed="rId26"/>
+                    <a:blip r:embed="rId33"/>
                     <a:stretch>
                       <a:fillRect/>
                     </a:stretch>
@@ -501,6 +796,20 @@
     </w:p>
     <w:p>
       <w:pPr>
+        <w:pStyle w:val="ImageCaption"/>
+      </w:pPr>
+      <w:r>
+        <w:t xml:space="preserve">Снова открываем файл:</w:t>
+      </w:r>
+      <w:r>
+        <w:t xml:space="preserve"> </w:t>
+      </w:r>
+      <w:r>
+        <w:t xml:space="preserve">‘vi hello.sh’</w:t>
+      </w:r>
+    </w:p>
+    <w:p>
+      <w:pPr>
         <w:pStyle w:val="BodyText"/>
       </w:pPr>
       <w:r>
@@ -527,25 +836,25 @@
     </w:p>
     <w:p>
       <w:pPr>
-        <w:pStyle w:val="BodyText"/>
+        <w:pStyle w:val="CaptionedFigure"/>
       </w:pPr>
       <w:r>
         <w:drawing>
           <wp:inline>
             <wp:extent cx="3733800" cy="2100262"/>
             <wp:effectExtent b="0" l="0" r="0" t="0"/>
-            <wp:docPr descr="" title="" id="30" name="Picture"/>
+            <wp:docPr descr="Заменяем текст в строках 2 и 4 командами последней строки: ‘:2s/HELL/HELLO/’, ‘:4s/LOCAL/local/’" title="" id="37" name="Picture"/>
             <a:graphic>
               <a:graphicData uri="http://schemas.openxmlformats.org/drawingml/2006/picture">
                 <pic:pic>
                   <pic:nvPicPr>
-                    <pic:cNvPr descr="фото/7.png" id="31" name="Picture"/>
+                    <pic:cNvPr descr="image/7.png" id="38" name="Picture"/>
                     <pic:cNvPicPr>
                       <a:picLocks noChangeArrowheads="1" noChangeAspect="1"/>
                     </pic:cNvPicPr>
                   </pic:nvPicPr>
                   <pic:blipFill>
-                    <a:blip r:embed="rId29"/>
+                    <a:blip r:embed="rId36"/>
                     <a:stretch>
                       <a:fillRect/>
                     </a:stretch>
@@ -574,6 +883,29 @@
     </w:p>
     <w:p>
       <w:pPr>
+        <w:pStyle w:val="ImageCaption"/>
+      </w:pPr>
+      <w:r>
+        <w:t xml:space="preserve">Заменяем текст в строках 2 и 4 командами последней строки:</w:t>
+      </w:r>
+      <w:r>
+        <w:t xml:space="preserve"> </w:t>
+      </w:r>
+      <w:r>
+        <w:t xml:space="preserve">‘:2s/HELL/HELLO/’</w:t>
+      </w:r>
+      <w:r>
+        <w:t xml:space="preserve">,</w:t>
+      </w:r>
+      <w:r>
+        <w:t xml:space="preserve"> </w:t>
+      </w:r>
+      <w:r>
+        <w:t xml:space="preserve">‘:4s/LOCAL/local/’</w:t>
+      </w:r>
+    </w:p>
+    <w:p>
+      <w:pPr>
         <w:pStyle w:val="BodyText"/>
       </w:pPr>
       <w:r>
@@ -612,25 +944,25 @@
     </w:p>
     <w:p>
       <w:pPr>
-        <w:pStyle w:val="BodyText"/>
+        <w:pStyle w:val="CaptionedFigure"/>
       </w:pPr>
       <w:r>
         <w:drawing>
           <wp:inline>
             <wp:extent cx="3733800" cy="2100262"/>
             <wp:effectExtent b="0" l="0" r="0" t="0"/>
-            <wp:docPr descr="" title="" id="33" name="Picture"/>
+            <wp:docPr descr="Переходим в конец файла (‘G’), открываем новую строку (‘o’), вводим ‘echo $HELLO’, ‘esc’" title="" id="40" name="Picture"/>
             <a:graphic>
               <a:graphicData uri="http://schemas.openxmlformats.org/drawingml/2006/picture">
                 <pic:pic>
                   <pic:nvPicPr>
-                    <pic:cNvPr descr="фото/8.png" id="34" name="Picture"/>
+                    <pic:cNvPr descr="image/8.png" id="41" name="Picture"/>
                     <pic:cNvPicPr>
                       <a:picLocks noChangeArrowheads="1" noChangeAspect="1"/>
                     </pic:cNvPicPr>
                   </pic:nvPicPr>
                   <pic:blipFill>
-                    <a:blip r:embed="rId32"/>
+                    <a:blip r:embed="rId39"/>
                     <a:stretch>
                       <a:fillRect/>
                     </a:stretch>
@@ -659,6 +991,41 @@
     </w:p>
     <w:p>
       <w:pPr>
+        <w:pStyle w:val="ImageCaption"/>
+      </w:pPr>
+      <w:r>
+        <w:t xml:space="preserve">Переходим в конец файла (</w:t>
+      </w:r>
+      <w:r>
+        <w:t xml:space="preserve">‘G’</w:t>
+      </w:r>
+      <w:r>
+        <w:t xml:space="preserve">), открываем новую строку (</w:t>
+      </w:r>
+      <w:r>
+        <w:t xml:space="preserve">‘o’</w:t>
+      </w:r>
+      <w:r>
+        <w:t xml:space="preserve">), вводим</w:t>
+      </w:r>
+      <w:r>
+        <w:t xml:space="preserve"> </w:t>
+      </w:r>
+      <w:r>
+        <w:t xml:space="preserve">‘echo $HELLO’</w:t>
+      </w:r>
+      <w:r>
+        <w:t xml:space="preserve">,</w:t>
+      </w:r>
+      <w:r>
+        <w:t xml:space="preserve"> </w:t>
+      </w:r>
+      <w:r>
+        <w:t xml:space="preserve">‘esc’</w:t>
+      </w:r>
+    </w:p>
+    <w:p>
+      <w:pPr>
         <w:pStyle w:val="BodyText"/>
       </w:pPr>
       <w:r>
@@ -685,25 +1052,25 @@
     </w:p>
     <w:p>
       <w:pPr>
-        <w:pStyle w:val="BodyText"/>
+        <w:pStyle w:val="CaptionedFigure"/>
       </w:pPr>
       <w:r>
         <w:drawing>
           <wp:inline>
             <wp:extent cx="3733800" cy="2100262"/>
             <wp:effectExtent b="0" l="0" r="0" t="0"/>
-            <wp:docPr descr="" title="" id="36" name="Picture"/>
+            <wp:docPr descr="Удаляем последнюю строку: ‘G’, ‘dd’" title="" id="43" name="Picture"/>
             <a:graphic>
               <a:graphicData uri="http://schemas.openxmlformats.org/drawingml/2006/picture">
                 <pic:pic>
                   <pic:nvPicPr>
-                    <pic:cNvPr descr="фото/9.png" id="37" name="Picture"/>
+                    <pic:cNvPr descr="image/9.png" id="44" name="Picture"/>
                     <pic:cNvPicPr>
                       <a:picLocks noChangeArrowheads="1" noChangeAspect="1"/>
                     </pic:cNvPicPr>
                   </pic:nvPicPr>
                   <pic:blipFill>
-                    <a:blip r:embed="rId35"/>
+                    <a:blip r:embed="rId42"/>
                     <a:stretch>
                       <a:fillRect/>
                     </a:stretch>
@@ -732,6 +1099,29 @@
     </w:p>
     <w:p>
       <w:pPr>
+        <w:pStyle w:val="ImageCaption"/>
+      </w:pPr>
+      <w:r>
+        <w:t xml:space="preserve">Удаляем последнюю строку:</w:t>
+      </w:r>
+      <w:r>
+        <w:t xml:space="preserve"> </w:t>
+      </w:r>
+      <w:r>
+        <w:t xml:space="preserve">‘G’</w:t>
+      </w:r>
+      <w:r>
+        <w:t xml:space="preserve">,</w:t>
+      </w:r>
+      <w:r>
+        <w:t xml:space="preserve"> </w:t>
+      </w:r>
+      <w:r>
+        <w:t xml:space="preserve">‘dd’</w:t>
+      </w:r>
+    </w:p>
+    <w:p>
+      <w:pPr>
         <w:pStyle w:val="BodyText"/>
       </w:pPr>
       <w:r>
@@ -749,25 +1139,25 @@
     </w:p>
     <w:p>
       <w:pPr>
-        <w:pStyle w:val="BodyText"/>
+        <w:pStyle w:val="CaptionedFigure"/>
       </w:pPr>
       <w:r>
         <w:drawing>
           <wp:inline>
             <wp:extent cx="3733800" cy="2100262"/>
             <wp:effectExtent b="0" l="0" r="0" t="0"/>
-            <wp:docPr descr="" title="" id="39" name="Picture"/>
+            <wp:docPr descr="Отменяем удаление: ‘u’" title="" id="46" name="Picture"/>
             <a:graphic>
               <a:graphicData uri="http://schemas.openxmlformats.org/drawingml/2006/picture">
                 <pic:pic>
                   <pic:nvPicPr>
-                    <pic:cNvPr descr="фото/10.png" id="40" name="Picture"/>
+                    <pic:cNvPr descr="image/10.png" id="47" name="Picture"/>
                     <pic:cNvPicPr>
                       <a:picLocks noChangeArrowheads="1" noChangeAspect="1"/>
                     </pic:cNvPicPr>
                   </pic:nvPicPr>
                   <pic:blipFill>
-                    <a:blip r:embed="rId38"/>
+                    <a:blip r:embed="rId45"/>
                     <a:stretch>
                       <a:fillRect/>
                     </a:stretch>
@@ -796,6 +1186,20 @@
     </w:p>
     <w:p>
       <w:pPr>
+        <w:pStyle w:val="ImageCaption"/>
+      </w:pPr>
+      <w:r>
+        <w:t xml:space="preserve">Отменяем удаление:</w:t>
+      </w:r>
+      <w:r>
+        <w:t xml:space="preserve"> </w:t>
+      </w:r>
+      <w:r>
+        <w:t xml:space="preserve">‘u’</w:t>
+      </w:r>
+    </w:p>
+    <w:p>
+      <w:pPr>
         <w:pStyle w:val="BodyText"/>
       </w:pPr>
       <w:r>
@@ -831,25 +1235,25 @@
     </w:p>
     <w:p>
       <w:pPr>
-        <w:pStyle w:val="BodyText"/>
+        <w:pStyle w:val="CaptionedFigure"/>
       </w:pPr>
       <w:r>
         <w:drawing>
           <wp:inline>
             <wp:extent cx="3733800" cy="2100262"/>
             <wp:effectExtent b="0" l="0" r="0" t="0"/>
-            <wp:docPr descr="" title="" id="42" name="Picture"/>
+            <wp:docPr descr="Сохраняем: ‘:wq’. Проверяем: ‘cat -n hello.sh’, ‘bash hello.sh’" title="" id="49" name="Picture"/>
             <a:graphic>
               <a:graphicData uri="http://schemas.openxmlformats.org/drawingml/2006/picture">
                 <pic:pic>
                   <pic:nvPicPr>
-                    <pic:cNvPr descr="фото/11.png" id="43" name="Picture"/>
+                    <pic:cNvPr descr="image/11.png" id="50" name="Picture"/>
                     <pic:cNvPicPr>
                       <a:picLocks noChangeArrowheads="1" noChangeAspect="1"/>
                     </pic:cNvPicPr>
                   </pic:nvPicPr>
                   <pic:blipFill>
-                    <a:blip r:embed="rId41"/>
+                    <a:blip r:embed="rId48"/>
                     <a:stretch>
                       <a:fillRect/>
                     </a:stretch>
@@ -876,14 +1280,46 @@
         </w:drawing>
       </w:r>
     </w:p>
-    <w:bookmarkEnd w:id="44"/>
-    <w:bookmarkStart w:id="45" w:name="выводы"/>
+    <w:p>
+      <w:pPr>
+        <w:pStyle w:val="ImageCaption"/>
+      </w:pPr>
+      <w:r>
+        <w:t xml:space="preserve">Сохраняем:</w:t>
+      </w:r>
+      <w:r>
+        <w:t xml:space="preserve"> </w:t>
+      </w:r>
+      <w:r>
+        <w:t xml:space="preserve">‘:wq’</w:t>
+      </w:r>
+      <w:r>
+        <w:t xml:space="preserve">. Проверяем:</w:t>
+      </w:r>
+      <w:r>
+        <w:t xml:space="preserve"> </w:t>
+      </w:r>
+      <w:r>
+        <w:t xml:space="preserve">‘cat -n hello.sh’</w:t>
+      </w:r>
+      <w:r>
+        <w:t xml:space="preserve">,</w:t>
+      </w:r>
+      <w:r>
+        <w:t xml:space="preserve"> </w:t>
+      </w:r>
+      <w:r>
+        <w:t xml:space="preserve">‘bash hello.sh’</w:t>
+      </w:r>
+    </w:p>
+    <w:bookmarkEnd w:id="51"/>
+    <w:bookmarkStart w:id="52" w:name="результаты"/>
     <w:p>
       <w:pPr>
         <w:pStyle w:val="Heading1"/>
       </w:pPr>
       <w:r>
-        <w:t xml:space="preserve">Выводы</w:t>
+        <w:t xml:space="preserve">5. Результаты</w:t>
       </w:r>
     </w:p>
     <w:p>
@@ -891,11 +1327,78 @@
         <w:pStyle w:val="FirstParagraph"/>
       </w:pPr>
       <w:r>
+        <w:t xml:space="preserve">В ходе выполнения работы получены следующие объективные результаты: Освоена работа с vi: создание и сохранение файла: режимы вставки и последней строки, поиск и замена текста, вставка/удаление строк, отмена действия.</w:t>
+      </w:r>
+    </w:p>
+    <w:bookmarkEnd w:id="52"/>
+    <w:bookmarkStart w:id="53" w:name="обсуждение-результатов"/>
+    <w:p>
+      <w:pPr>
+        <w:pStyle w:val="Heading1"/>
+      </w:pPr>
+      <w:r>
+        <w:t xml:space="preserve">6. Обсуждение результатов</w:t>
+      </w:r>
+    </w:p>
+    <w:p>
+      <w:pPr>
+        <w:pStyle w:val="FirstParagraph"/>
+      </w:pPr>
+      <w:r>
+        <w:t xml:space="preserve">Редактирование через модальный интерфейс vi потребовало больше итераций на старте (привыкание к режимам), но после этого выполнялось быстрее, чем в немодальном редакторе.</w:t>
+      </w:r>
+    </w:p>
+    <w:bookmarkEnd w:id="53"/>
+    <w:bookmarkStart w:id="54" w:name="заключение"/>
+    <w:p>
+      <w:pPr>
+        <w:pStyle w:val="Heading1"/>
+      </w:pPr>
+      <w:r>
+        <w:t xml:space="preserve">7. Заключение</w:t>
+      </w:r>
+    </w:p>
+    <w:p>
+      <w:pPr>
+        <w:pStyle w:val="FirstParagraph"/>
+      </w:pPr>
+      <w:r>
         <w:t xml:space="preserve">Освоена работа с vi: создание и сохранение файла: режимы вставки и последней строки, поиск и замена текста, вставка/удаление строк, отмена действия.</w:t>
       </w:r>
     </w:p>
-    <w:bookmarkEnd w:id="45"/>
-    <w:bookmarkStart w:id="46" w:name="ответы-на-контрольные-вопросы"/>
+    <w:bookmarkEnd w:id="54"/>
+    <w:bookmarkStart w:id="57" w:name="список-литературы"/>
+    <w:p>
+      <w:pPr>
+        <w:pStyle w:val="Heading1"/>
+      </w:pPr>
+      <w:r>
+        <w:t xml:space="preserve">Список литературы</w:t>
+      </w:r>
+    </w:p>
+    <w:bookmarkStart w:id="56" w:name="refs"/>
+    <w:bookmarkStart w:id="55" w:name="ref-lamb_book_vi-vim_en"/>
+    <w:p>
+      <w:pPr>
+        <w:pStyle w:val="Bibliography"/>
+      </w:pPr>
+      <w:r>
+        <w:t xml:space="preserve">1.</w:t>
+      </w:r>
+      <w:r>
+        <w:t xml:space="preserve"> </w:t>
+      </w:r>
+      <w:r>
+        <w:t xml:space="preserve">	</w:t>
+      </w:r>
+      <w:r>
+        <w:t xml:space="preserve">Lamb L., Robbins A. Learning the vi and Vim Editors. O’Reilly Media, 2008.</w:t>
+      </w:r>
+    </w:p>
+    <w:bookmarkEnd w:id="55"/>
+    <w:bookmarkEnd w:id="56"/>
+    <w:bookmarkEnd w:id="57"/>
+    <w:bookmarkStart w:id="58" w:name="ответы-на-контрольные-вопросы"/>
     <w:p>
       <w:pPr>
         <w:pStyle w:val="Heading1"/>
@@ -1389,7 +1892,7 @@
         <w:t xml:space="preserve">/enter - обратно в командный.</w:t>
       </w:r>
     </w:p>
-    <w:bookmarkEnd w:id="46"/>
+    <w:bookmarkEnd w:id="58"/>
     <w:sectPr>
       <w:footnotePr>
         <w:numRestart w:val="eachSect"/>
@@ -1617,10 +2120,10 @@
   <w:docDefaults>
     <w:rPrDefault>
       <w:rPr>
-        <w:rFonts w:asciiTheme="minorHAnsi" w:cstheme="minorBidi" w:eastAsiaTheme="minorHAnsi" w:hAnsiTheme="minorHAnsi"/>
+        <w:rFonts w:asciiTheme="minorHAnsi" w:cstheme="minorBidi" w:eastAsiaTheme="minorEastAsia" w:hAnsiTheme="minorHAnsi"/>
         <w:sz w:val="24"/>
         <w:szCs w:val="24"/>
-        <w:lang w:bidi="ar-SA" w:eastAsia="en-US" w:val="en-US"/>
+        <w:lang w:bidi="ar-SA" w:eastAsia="zh-CN" w:val="ru-RU"/>
       </w:rPr>
     </w:rPrDefault>
     <w:pPrDefault>
@@ -2161,13 +2664,6 @@
       </w:tblCellMar>
     </w:tblPr>
     <w:tblStylePr w:type="firstRow">
-      <w:tblPr>
-        <w:jc w:val="left"/>
-        <w:tblInd w:type="dxa" w:w="0"/>
-      </w:tblPr>
-      <w:trPr>
-        <w:jc w:val="left"/>
-      </w:trPr>
       <w:tcPr>
         <w:tcBorders>
           <w:bottom w:val="single"/>
@@ -2281,6 +2777,7 @@
     <w:link w:val="VerbatimChar"/>
     <w:pPr>
       <w:wordWrap w:val="off"/>
+      <w:shd w:val="clear" w:fill="f1f3f5"/>
     </w:pPr>
   </w:style>
   <w:style w:type="character" w:customStyle="1" w:styleId="KeywordTok">
@@ -2288,93 +2785,104 @@
     <w:basedOn w:val="VerbatimChar"/>
     <w:rPr>
       <w:b/>
-      <w:color w:val="007020"/>
+      <w:color w:val="003b4f"/>
+      <w:shd w:val="clear" w:fill="f1f3f5"/>
     </w:rPr>
   </w:style>
   <w:style w:type="character" w:customStyle="1" w:styleId="DataTypeTok">
     <w:name w:val="DataTypeTok"/>
     <w:basedOn w:val="VerbatimChar"/>
     <w:rPr>
-      <w:color w:val="902000"/>
+      <w:color w:val="ad0000"/>
+      <w:shd w:val="clear" w:fill="f1f3f5"/>
     </w:rPr>
   </w:style>
   <w:style w:type="character" w:customStyle="1" w:styleId="DecValTok">
     <w:name w:val="DecValTok"/>
     <w:basedOn w:val="VerbatimChar"/>
     <w:rPr>
-      <w:color w:val="40a070"/>
+      <w:color w:val="ad0000"/>
+      <w:shd w:val="clear" w:fill="f1f3f5"/>
     </w:rPr>
   </w:style>
   <w:style w:type="character" w:customStyle="1" w:styleId="BaseNTok">
     <w:name w:val="BaseNTok"/>
     <w:basedOn w:val="VerbatimChar"/>
     <w:rPr>
-      <w:color w:val="40a070"/>
+      <w:color w:val="ad0000"/>
+      <w:shd w:val="clear" w:fill="f1f3f5"/>
     </w:rPr>
   </w:style>
   <w:style w:type="character" w:customStyle="1" w:styleId="FloatTok">
     <w:name w:val="FloatTok"/>
     <w:basedOn w:val="VerbatimChar"/>
     <w:rPr>
-      <w:color w:val="40a070"/>
+      <w:color w:val="ad0000"/>
+      <w:shd w:val="clear" w:fill="f1f3f5"/>
     </w:rPr>
   </w:style>
   <w:style w:type="character" w:customStyle="1" w:styleId="ConstantTok">
     <w:name w:val="ConstantTok"/>
     <w:basedOn w:val="VerbatimChar"/>
     <w:rPr>
-      <w:color w:val="880000"/>
+      <w:color w:val="8f5902"/>
+      <w:shd w:val="clear" w:fill="f1f3f5"/>
     </w:rPr>
   </w:style>
   <w:style w:type="character" w:customStyle="1" w:styleId="CharTok">
     <w:name w:val="CharTok"/>
     <w:basedOn w:val="VerbatimChar"/>
     <w:rPr>
-      <w:color w:val="4070a0"/>
+      <w:color w:val="20794d"/>
+      <w:shd w:val="clear" w:fill="f1f3f5"/>
     </w:rPr>
   </w:style>
   <w:style w:type="character" w:customStyle="1" w:styleId="SpecialCharTok">
     <w:name w:val="SpecialCharTok"/>
     <w:basedOn w:val="VerbatimChar"/>
     <w:rPr>
-      <w:color w:val="4070a0"/>
+      <w:color w:val="5e5e5e"/>
+      <w:shd w:val="clear" w:fill="f1f3f5"/>
     </w:rPr>
   </w:style>
   <w:style w:type="character" w:customStyle="1" w:styleId="StringTok">
     <w:name w:val="StringTok"/>
     <w:basedOn w:val="VerbatimChar"/>
     <w:rPr>
-      <w:color w:val="4070a0"/>
+      <w:color w:val="20794d"/>
+      <w:shd w:val="clear" w:fill="f1f3f5"/>
     </w:rPr>
   </w:style>
   <w:style w:type="character" w:customStyle="1" w:styleId="VerbatimStringTok">
     <w:name w:val="VerbatimStringTok"/>
     <w:basedOn w:val="VerbatimChar"/>
     <w:rPr>
-      <w:color w:val="4070a0"/>
+      <w:color w:val="20794d"/>
+      <w:shd w:val="clear" w:fill="f1f3f5"/>
     </w:rPr>
   </w:style>
   <w:style w:type="character" w:customStyle="1" w:styleId="SpecialStringTok">
     <w:name w:val="SpecialStringTok"/>
     <w:basedOn w:val="VerbatimChar"/>
     <w:rPr>
-      <w:color w:val="bb6688"/>
+      <w:color w:val="20794d"/>
+      <w:shd w:val="clear" w:fill="f1f3f5"/>
     </w:rPr>
   </w:style>
   <w:style w:type="character" w:customStyle="1" w:styleId="ImportTok">
     <w:name w:val="ImportTok"/>
     <w:basedOn w:val="VerbatimChar"/>
     <w:rPr>
-      <w:b/>
-      <w:color w:val="008000"/>
+      <w:color w:val="00769e"/>
+      <w:shd w:val="clear" w:fill="f1f3f5"/>
     </w:rPr>
   </w:style>
   <w:style w:type="character" w:customStyle="1" w:styleId="CommentTok">
     <w:name w:val="CommentTok"/>
     <w:basedOn w:val="VerbatimChar"/>
     <w:rPr>
-      <w:i/>
-      <w:color w:val="60a0b0"/>
+      <w:color w:val="5e5e5e"/>
+      <w:shd w:val="clear" w:fill="f1f3f5"/>
     </w:rPr>
   </w:style>
   <w:style w:type="character" w:customStyle="1" w:styleId="DocumentationTok">
@@ -2382,46 +2890,49 @@
     <w:basedOn w:val="VerbatimChar"/>
     <w:rPr>
       <w:i/>
-      <w:color w:val="ba2121"/>
+      <w:color w:val="5e5e5e"/>
+      <w:shd w:val="clear" w:fill="f1f3f5"/>
     </w:rPr>
   </w:style>
   <w:style w:type="character" w:customStyle="1" w:styleId="AnnotationTok">
     <w:name w:val="AnnotationTok"/>
     <w:basedOn w:val="VerbatimChar"/>
     <w:rPr>
-      <w:b/>
-      <w:i/>
-      <w:color w:val="60a0b0"/>
+      <w:color w:val="5e5e5e"/>
+      <w:shd w:val="clear" w:fill="f1f3f5"/>
     </w:rPr>
   </w:style>
   <w:style w:type="character" w:customStyle="1" w:styleId="CommentVarTok">
     <w:name w:val="CommentVarTok"/>
     <w:basedOn w:val="VerbatimChar"/>
     <w:rPr>
-      <w:b/>
       <w:i/>
-      <w:color w:val="60a0b0"/>
+      <w:color w:val="5e5e5e"/>
+      <w:shd w:val="clear" w:fill="f1f3f5"/>
     </w:rPr>
   </w:style>
   <w:style w:type="character" w:customStyle="1" w:styleId="OtherTok">
     <w:name w:val="OtherTok"/>
     <w:basedOn w:val="VerbatimChar"/>
     <w:rPr>
-      <w:color w:val="007020"/>
+      <w:color w:val="003b4f"/>
+      <w:shd w:val="clear" w:fill="f1f3f5"/>
     </w:rPr>
   </w:style>
   <w:style w:type="character" w:customStyle="1" w:styleId="FunctionTok">
     <w:name w:val="FunctionTok"/>
     <w:basedOn w:val="VerbatimChar"/>
     <w:rPr>
-      <w:color w:val="06287e"/>
+      <w:color w:val="4758ab"/>
+      <w:shd w:val="clear" w:fill="f1f3f5"/>
     </w:rPr>
   </w:style>
   <w:style w:type="character" w:customStyle="1" w:styleId="VariableTok">
     <w:name w:val="VariableTok"/>
     <w:basedOn w:val="VerbatimChar"/>
     <w:rPr>
-      <w:color w:val="19177c"/>
+      <w:color w:val="111111"/>
+      <w:shd w:val="clear" w:fill="f1f3f5"/>
     </w:rPr>
   </w:style>
   <w:style w:type="character" w:customStyle="1" w:styleId="ControlFlowTok">
@@ -2429,85 +2940,98 @@
     <w:basedOn w:val="VerbatimChar"/>
     <w:rPr>
       <w:b/>
-      <w:color w:val="007020"/>
+      <w:color w:val="003b4f"/>
+      <w:shd w:val="clear" w:fill="f1f3f5"/>
     </w:rPr>
   </w:style>
   <w:style w:type="character" w:customStyle="1" w:styleId="OperatorTok">
     <w:name w:val="OperatorTok"/>
     <w:basedOn w:val="VerbatimChar"/>
     <w:rPr>
-      <w:color w:val="666666"/>
+      <w:color w:val="5e5e5e"/>
+      <w:shd w:val="clear" w:fill="f1f3f5"/>
     </w:rPr>
   </w:style>
   <w:style w:type="character" w:customStyle="1" w:styleId="BuiltInTok">
     <w:name w:val="BuiltInTok"/>
     <w:basedOn w:val="VerbatimChar"/>
     <w:rPr>
-      <w:color w:val="008000"/>
+      <w:color w:val="003b4f"/>
+      <w:shd w:val="clear" w:fill="f1f3f5"/>
     </w:rPr>
   </w:style>
   <w:style w:type="character" w:customStyle="1" w:styleId="ExtensionTok">
     <w:name w:val="ExtensionTok"/>
     <w:basedOn w:val="VerbatimChar"/>
-    <w:rPr/>
+    <w:rPr>
+      <w:color w:val="003b4f"/>
+      <w:shd w:val="clear" w:fill="f1f3f5"/>
+    </w:rPr>
   </w:style>
   <w:style w:type="character" w:customStyle="1" w:styleId="PreprocessorTok">
     <w:name w:val="PreprocessorTok"/>
     <w:basedOn w:val="VerbatimChar"/>
     <w:rPr>
-      <w:color w:val="bc7a00"/>
+      <w:color w:val="ad0000"/>
+      <w:shd w:val="clear" w:fill="f1f3f5"/>
     </w:rPr>
   </w:style>
   <w:style w:type="character" w:customStyle="1" w:styleId="AttributeTok">
     <w:name w:val="AttributeTok"/>
     <w:basedOn w:val="VerbatimChar"/>
     <w:rPr>
-      <w:color w:val="7d9029"/>
+      <w:color w:val="657422"/>
+      <w:shd w:val="clear" w:fill="f1f3f5"/>
     </w:rPr>
   </w:style>
   <w:style w:type="character" w:customStyle="1" w:styleId="RegionMarkerTok">
     <w:name w:val="RegionMarkerTok"/>
     <w:basedOn w:val="VerbatimChar"/>
-    <w:rPr/>
+    <w:rPr>
+      <w:color w:val="003b4f"/>
+      <w:shd w:val="clear" w:fill="f1f3f5"/>
+    </w:rPr>
   </w:style>
   <w:style w:type="character" w:customStyle="1" w:styleId="InformationTok">
     <w:name w:val="InformationTok"/>
     <w:basedOn w:val="VerbatimChar"/>
     <w:rPr>
-      <w:b/>
-      <w:i/>
-      <w:color w:val="60a0b0"/>
+      <w:color w:val="5e5e5e"/>
+      <w:shd w:val="clear" w:fill="f1f3f5"/>
     </w:rPr>
   </w:style>
   <w:style w:type="character" w:customStyle="1" w:styleId="WarningTok">
     <w:name w:val="WarningTok"/>
     <w:basedOn w:val="VerbatimChar"/>
     <w:rPr>
-      <w:b/>
       <w:i/>
-      <w:color w:val="60a0b0"/>
+      <w:color w:val="5e5e5e"/>
+      <w:shd w:val="clear" w:fill="f1f3f5"/>
     </w:rPr>
   </w:style>
   <w:style w:type="character" w:customStyle="1" w:styleId="AlertTok">
     <w:name w:val="AlertTok"/>
     <w:basedOn w:val="VerbatimChar"/>
     <w:rPr>
-      <w:b/>
-      <w:color w:val="ff0000"/>
+      <w:color w:val="ad0000"/>
+      <w:shd w:val="clear" w:fill="f1f3f5"/>
     </w:rPr>
   </w:style>
   <w:style w:type="character" w:customStyle="1" w:styleId="ErrorTok">
     <w:name w:val="ErrorTok"/>
     <w:basedOn w:val="VerbatimChar"/>
     <w:rPr>
-      <w:b/>
-      <w:color w:val="ff0000"/>
+      <w:color w:val="ad0000"/>
+      <w:shd w:val="clear" w:fill="f1f3f5"/>
     </w:rPr>
   </w:style>
   <w:style w:type="character" w:customStyle="1" w:styleId="NormalTok">
     <w:name w:val="NormalTok"/>
     <w:basedOn w:val="VerbatimChar"/>
-    <w:rPr/>
+    <w:rPr>
+      <w:color w:val="003b4f"/>
+      <w:shd w:val="clear" w:fill="f1f3f5"/>
+    </w:rPr>
   </w:style>
 </w:styles>
 </file>

</xml_diff>